<commit_message>
docs(modèles): mise à jour des modèles de contrats et de cautions
</commit_message>
<xml_diff>
--- a/document_templates/Contracts-deferral/company/contract_company.docx
+++ b/document_templates/Contracts-deferral/company/contract_company.docx
@@ -261,8 +261,10 @@
           <w:sz w:val="24"/>
           <w:szCs w:val="24"/>
         </w:rPr>
-        <w:t>, Head Crédit</w:t>
-      </w:r>
+        <w:t>, Responsable du Département Crédit</w:t>
+      </w:r>
+      <w:bookmarkStart w:id="10" w:name="_GoBack"/>
+      <w:bookmarkEnd w:id="10"/>
       <w:r>
         <w:rPr>
           <w:rFonts w:hint="default" w:ascii="Times New Roman" w:hAnsi="Times New Roman" w:cs="Times New Roman"/>
@@ -5749,8 +5751,6 @@
         </w:rPr>
         <w:t>Responsable juridique</w:t>
       </w:r>
-      <w:bookmarkStart w:id="10" w:name="_GoBack"/>
-      <w:bookmarkEnd w:id="10"/>
     </w:p>
     <w:p>
       <w:pPr>

</xml_diff>